<commit_message>
May 2026 code and data updates
Normal monthly updates for time constants and HBR/Mass estimation files.

Updates the ConjDecoder to handle an updated file format.

Updates the PcMultiStepWithPlots (and associated sub-functions and
documentation) to set a new default CA distribution setting. This
setting places the secondary in the 1st quadrant and aligns the axes
with the principal axes of the 2D-Pc ellipse. Additionally, added extra
output variables to the "out" structure for use with external scripts.
</commit_message>
<xml_diff>
--- a/DistributedMatlab/ProbabilityOfCollision/Documentation/SDK_Documentation_PcMultiStepCalculations.docx
+++ b/DistributedMatlab/ProbabilityOfCollision/Documentation/SDK_Documentation_PcMultiStepCalculations.docx
@@ -235,6 +235,7 @@
           <w:i/>
         </w:rPr>
       </w:pPr>
+      <w:proofErr w:type="spellStart"/>
       <w:r>
         <w:rPr>
           <w:rFonts w:cstheme="minorHAnsi"/>
@@ -242,6 +243,7 @@
         </w:rPr>
         <w:t>Omitron</w:t>
       </w:r>
+      <w:proofErr w:type="spellEnd"/>
       <w:r>
         <w:rPr>
           <w:rFonts w:cstheme="minorHAnsi"/>
@@ -359,7 +361,7 @@
         <w:rPr>
           <w:b/>
         </w:rPr>
-        <w:t>September</w:t>
+        <w:t>April</w:t>
       </w:r>
       <w:r>
         <w:rPr>
@@ -371,7 +373,7 @@
         <w:rPr>
           <w:b/>
         </w:rPr>
-        <w:t>5</w:t>
+        <w:t>6</w:t>
       </w:r>
       <w:r>
         <w:rPr>
@@ -428,7 +430,21 @@
         <w:rPr>
           <w:rFonts w:cs="Arial"/>
         </w:rPr>
-        <w:t>Multi Step Probability of Collision (PcMultiStep)</w:t>
+        <w:t>Multi Step Probability of Collision (</w:t>
+      </w:r>
+      <w:proofErr w:type="spellStart"/>
+      <w:r>
+        <w:rPr>
+          <w:rFonts w:cs="Arial"/>
+        </w:rPr>
+        <w:t>PcMultiStep</w:t>
+      </w:r>
+      <w:proofErr w:type="spellEnd"/>
+      <w:r>
+        <w:rPr>
+          <w:rFonts w:cs="Arial"/>
+        </w:rPr>
+        <w:t>)</w:t>
       </w:r>
       <w:r>
         <w:rPr>
@@ -461,8 +477,8 @@
         <w:br w:type="page"/>
       </w:r>
     </w:p>
-    <w:bookmarkStart w:id="0" w:name="_Toc412167130" w:displacedByCustomXml="next"/>
-    <w:bookmarkStart w:id="1" w:name="_Toc412161101" w:displacedByCustomXml="next"/>
+    <w:bookmarkStart w:id="0" w:name="_Toc412161101" w:displacedByCustomXml="next"/>
+    <w:bookmarkStart w:id="1" w:name="_Toc412167130" w:displacedByCustomXml="next"/>
     <w:sdt>
       <w:sdtPr>
         <w:rPr>
@@ -473,12 +489,6 @@
           <w:sz w:val="22"/>
           <w:szCs w:val="22"/>
           <w:lang w:eastAsia="en-US"/>
-          <w14:scene3d>
-            <w14:camera w14:prst="orthographicFront"/>
-            <w14:lightRig w14:rig="threePt" w14:dir="t">
-              <w14:rot w14:lat="0" w14:lon="0" w14:rev="0"/>
-            </w14:lightRig>
-          </w14:scene3d>
         </w:rPr>
         <w:id w:val="-850725531"/>
         <w:docPartObj>
@@ -489,12 +499,6 @@
       <w:sdtEndPr>
         <w:rPr>
           <w:noProof/>
-          <w14:scene3d>
-            <w14:camera w14:prst="orthographicFront"/>
-            <w14:lightRig w14:rig="threePt" w14:dir="t">
-              <w14:rot w14:lat="0" w14:lon="0" w14:rev="0"/>
-            </w14:lightRig>
-          </w14:scene3d>
         </w:rPr>
       </w:sdtEndPr>
       <w:sdtContent>
@@ -1892,8 +1896,13 @@
           <w:szCs w:val="32"/>
         </w:rPr>
       </w:pPr>
-      <w:r>
-        <w:t>Matlab 201</w:t>
+      <w:proofErr w:type="spellStart"/>
+      <w:r>
+        <w:t>Matlab</w:t>
+      </w:r>
+      <w:proofErr w:type="spellEnd"/>
+      <w:r>
+        <w:t xml:space="preserve"> 201</w:t>
       </w:r>
       <w:r>
         <w:t>9b</w:t>
@@ -1946,8 +1955,13 @@
       <w:bookmarkStart w:id="11" w:name="_Toc506456186"/>
       <w:bookmarkStart w:id="12" w:name="_Ref511050272"/>
       <w:bookmarkStart w:id="13" w:name="_Ref511050278"/>
-      <w:r>
-        <w:t>PcMultiStep Calculation</w:t>
+      <w:proofErr w:type="spellStart"/>
+      <w:r>
+        <w:t>PcMultiStep</w:t>
+      </w:r>
+      <w:proofErr w:type="spellEnd"/>
+      <w:r>
+        <w:t xml:space="preserve"> Calculation</w:t>
       </w:r>
       <w:bookmarkEnd w:id="9"/>
       <w:bookmarkEnd w:id="10"/>
@@ -1963,13 +1977,21 @@
         <w:t xml:space="preserve"> temporally</w:t>
       </w:r>
       <w:r>
-        <w:t xml:space="preserve"> isolated conjunction is the “PcMultiS</w:t>
+        <w:t xml:space="preserve"> isolated conjunction is the “</w:t>
+      </w:r>
+      <w:proofErr w:type="spellStart"/>
+      <w:r>
+        <w:t>PcMultiS</w:t>
       </w:r>
       <w:r>
         <w:t>t</w:t>
       </w:r>
       <w:r>
-        <w:t xml:space="preserve">ep” algorithm formulated by Hall </w:t>
+        <w:t>ep</w:t>
+      </w:r>
+      <w:proofErr w:type="spellEnd"/>
+      <w:r>
+        <w:t xml:space="preserve">” algorithm formulated by Hall </w:t>
       </w:r>
       <w:r>
         <w:t>et. al.</w:t>
@@ -2001,7 +2023,15 @@
         <w:t xml:space="preserve"> increasingly accurate Pc estimation methods, but only as required for efficiency.</w:t>
       </w:r>
       <w:r>
-        <w:t xml:space="preserve"> The Pc estimation methods implemented within PcMultiStep are:</w:t>
+        <w:t xml:space="preserve"> The Pc estimation methods implemented within </w:t>
+      </w:r>
+      <w:proofErr w:type="spellStart"/>
+      <w:r>
+        <w:t>PcMultiStep</w:t>
+      </w:r>
+      <w:proofErr w:type="spellEnd"/>
+      <w:r>
+        <w:t xml:space="preserve"> are:</w:t>
       </w:r>
     </w:p>
     <w:p>
@@ -2013,8 +2043,13 @@
         </w:numPr>
       </w:pPr>
       <w:r>
-        <w:t>The 2D-Pc method: the two-dimensional collision probability method estimates Pc values for rectilinear motion conjunctions by calculating an integral over a circular region on the conjunction plane. Implemented via the PcCircle.m</w:t>
-      </w:r>
+        <w:t xml:space="preserve">The 2D-Pc method: the two-dimensional collision probability method estimates Pc values for rectilinear motion conjunctions by calculating an integral over a circular region on the conjunction plane. Implemented via the </w:t>
+      </w:r>
+      <w:proofErr w:type="spellStart"/>
+      <w:r>
+        <w:t>PcCircle.m</w:t>
+      </w:r>
+      <w:proofErr w:type="spellEnd"/>
       <w:r>
         <w:t xml:space="preserve"> function</w:t>
       </w:r>
@@ -2076,7 +2111,15 @@
         </w:numPr>
       </w:pPr>
       <w:r>
-        <w:t>The SDMC method: the Simplified Dynamics Monte Carlo (SDMC) method estimates Pc values for curvilinear motion conjunctions by calculating a sampled series of two-body motion trajectory propagations. Implemented via the Pc_SDMC.m function.</w:t>
+        <w:t xml:space="preserve">The SDMC method: the Simplified Dynamics Monte Carlo (SDMC) method estimates Pc values for curvilinear motion conjunctions by calculating a sampled series of two-body motion trajectory propagations. Implemented via the </w:t>
+      </w:r>
+      <w:proofErr w:type="spellStart"/>
+      <w:r>
+        <w:t>Pc_SDMC.m</w:t>
+      </w:r>
+      <w:proofErr w:type="spellEnd"/>
+      <w:r>
+        <w:t xml:space="preserve"> function.</w:t>
       </w:r>
     </w:p>
     <w:p>
@@ -2087,7 +2130,15 @@
         <w:t>The first three methods represent semi-analytical approximations, and the last one a Monte Carlo approach. Because the computation required by each successive method increases significantly, the multistep algorithm by default invokes each only as required for efficiency.</w:t>
       </w:r>
       <w:r>
-        <w:t xml:space="preserve"> The determination of whether or not a more accurate Pc method is needed is enabled by usage violation checks that are made after each Pc calculation. For the 2D-Pc method, the usage violation checks are:</w:t>
+        <w:t xml:space="preserve"> The determination of </w:t>
+      </w:r>
+      <w:proofErr w:type="gramStart"/>
+      <w:r>
+        <w:t>whether or not</w:t>
+      </w:r>
+      <w:proofErr w:type="gramEnd"/>
+      <w:r>
+        <w:t xml:space="preserve"> a more accurate Pc method is needed is enabled by usage violation checks that are made after each Pc calculation. For the 2D-Pc method, the usage violation checks are:</w:t>
       </w:r>
     </w:p>
     <w:p>
@@ -2111,7 +2162,15 @@
         </w:numPr>
       </w:pPr>
       <w:r>
-        <w:t xml:space="preserve">“Offset” violations indicate if the time between the TCA and the time of minimum Mahalanobis </w:t>
+        <w:t xml:space="preserve">“Offset” violations indicate if the time between the TCA and the time of minimum </w:t>
+      </w:r>
+      <w:proofErr w:type="spellStart"/>
+      <w:r>
+        <w:t>Mahalanobis</w:t>
+      </w:r>
+      <w:proofErr w:type="spellEnd"/>
+      <w:r>
+        <w:t xml:space="preserve"> </w:t>
       </w:r>
       <w:r>
         <w:t>distance for the rectilinear encounter is potentially too long.</w:t>
@@ -2138,7 +2197,15 @@
         </w:numPr>
       </w:pPr>
       <w:r>
-        <w:t>“Inaccuracy” violations indicate if the Mahalanobis distances for the rectilinear vs curvilinear encounters potentially differ by too much.</w:t>
+        <w:t xml:space="preserve">“Inaccuracy” violations indicate if the </w:t>
+      </w:r>
+      <w:proofErr w:type="spellStart"/>
+      <w:r>
+        <w:t>Mahalanobis</w:t>
+      </w:r>
+      <w:proofErr w:type="spellEnd"/>
+      <w:r>
+        <w:t xml:space="preserve"> distances for the rectilinear vs curvilinear encounters potentially differ by too much.</w:t>
       </w:r>
     </w:p>
     <w:p>
@@ -2163,7 +2230,15 @@
         <w:pStyle w:val="BodyText"/>
       </w:pPr>
       <w:r>
-        <w:t>See Hall et. al. (2023)</w:t>
+        <w:t xml:space="preserve">See Hall et. </w:t>
+      </w:r>
+      <w:proofErr w:type="gramStart"/>
+      <w:r>
+        <w:t>al</w:t>
+      </w:r>
+      <w:proofErr w:type="gramEnd"/>
+      <w:r>
+        <w:t>. (2023)</w:t>
       </w:r>
       <w:r>
         <w:rPr>
@@ -2218,8 +2293,13 @@
         <w:pStyle w:val="Heading3"/>
       </w:pPr>
       <w:bookmarkStart w:id="15" w:name="_Toc208937292"/>
-      <w:r>
-        <w:t>PcMultiStep Source Code Description</w:t>
+      <w:proofErr w:type="spellStart"/>
+      <w:r>
+        <w:t>PcMultiStep</w:t>
+      </w:r>
+      <w:proofErr w:type="spellEnd"/>
+      <w:r>
+        <w:t xml:space="preserve"> Source Code Description</w:t>
       </w:r>
       <w:bookmarkEnd w:id="15"/>
     </w:p>
@@ -2228,7 +2308,15 @@
         <w:pStyle w:val="BodyText"/>
       </w:pPr>
       <w:r>
-        <w:t xml:space="preserve">Three separate PcMultiStep </w:t>
+        <w:t xml:space="preserve">Three separate </w:t>
+      </w:r>
+      <w:proofErr w:type="spellStart"/>
+      <w:r>
+        <w:t>PcMultiStep</w:t>
+      </w:r>
+      <w:proofErr w:type="spellEnd"/>
+      <w:r>
+        <w:t xml:space="preserve"> </w:t>
       </w:r>
       <w:r>
         <w:t>functions have been provided</w:t>
@@ -2304,8 +2392,13 @@
       <w:r>
         <w:t xml:space="preserve">: </w:t>
       </w:r>
-      <w:r>
-        <w:t>PcMultiStep Functions</w:t>
+      <w:proofErr w:type="spellStart"/>
+      <w:r>
+        <w:t>PcMultiStep</w:t>
+      </w:r>
+      <w:proofErr w:type="spellEnd"/>
+      <w:r>
+        <w:t xml:space="preserve"> Functions</w:t>
       </w:r>
       <w:bookmarkEnd w:id="17"/>
     </w:p>
@@ -2380,9 +2473,11 @@
               <w:pStyle w:val="BodyText"/>
               <w:spacing w:before="0" w:after="0"/>
             </w:pPr>
+            <w:proofErr w:type="spellStart"/>
             <w:r>
               <w:t>PcMultiStep.m</w:t>
             </w:r>
+            <w:proofErr w:type="spellEnd"/>
           </w:p>
         </w:tc>
         <w:tc>
@@ -2416,9 +2511,11 @@
               <w:pStyle w:val="BodyText"/>
               <w:spacing w:before="0" w:after="0"/>
             </w:pPr>
+            <w:proofErr w:type="spellStart"/>
             <w:r>
               <w:t>PcMultiStepWithSDMC.m</w:t>
             </w:r>
+            <w:proofErr w:type="spellEnd"/>
           </w:p>
         </w:tc>
         <w:tc>
@@ -2433,8 +2530,21 @@
               <w:pStyle w:val="BodyText"/>
               <w:spacing w:before="0" w:after="0"/>
             </w:pPr>
-            <w:r>
-              <w:t>Extends PcMultiStep.m by adding the SDMC method (and usage violation checks) to the</w:t>
+            <w:proofErr w:type="gramStart"/>
+            <w:r>
+              <w:t>Extends</w:t>
+            </w:r>
+            <w:proofErr w:type="gramEnd"/>
+            <w:r>
+              <w:t xml:space="preserve"> </w:t>
+            </w:r>
+            <w:proofErr w:type="spellStart"/>
+            <w:r>
+              <w:t>PcMultiStep.m</w:t>
+            </w:r>
+            <w:proofErr w:type="spellEnd"/>
+            <w:r>
+              <w:t xml:space="preserve"> by adding the SDMC method (and usage violation checks) to the</w:t>
             </w:r>
             <w:r>
               <w:t xml:space="preserve"> set of calculations used. This method is appropriate for more complete offline analyses where verification of the other Pc methods may be warranted.</w:t>
@@ -2455,9 +2565,11 @@
               <w:pStyle w:val="BodyText"/>
               <w:spacing w:before="0" w:after="0"/>
             </w:pPr>
+            <w:proofErr w:type="spellStart"/>
             <w:r>
               <w:t>PcMultiStepWithPlots.m</w:t>
             </w:r>
+            <w:proofErr w:type="spellEnd"/>
           </w:p>
         </w:tc>
         <w:tc>
@@ -2470,7 +2582,15 @@
               <w:spacing w:before="0" w:after="0"/>
             </w:pPr>
             <w:r>
-              <w:t>Extends PcMultiStepWithSDMC.m by generating Close Approach Distribution and Pc Temporal plots using outputs from all four Pc methods. See section</w:t>
+              <w:t xml:space="preserve">Extends </w:t>
+            </w:r>
+            <w:proofErr w:type="spellStart"/>
+            <w:r>
+              <w:t>PcMultiStepWithSDMC.m</w:t>
+            </w:r>
+            <w:proofErr w:type="spellEnd"/>
+            <w:r>
+              <w:t xml:space="preserve"> by generating Close Approach Distribution and Pc Temporal plots using outputs from all four Pc methods. See section</w:t>
             </w:r>
             <w:r>
               <w:t xml:space="preserve"> </w:t>
@@ -2508,7 +2628,23 @@
         <w:t>All three functions share similar input and output parameter lists.</w:t>
       </w:r>
       <w:r>
-        <w:t xml:space="preserve"> In fact, these parameter lists are shared across all Pc calculation subfunctions (e.g., PcCircle.m, Pc2D_Hall.m, etc.) so that the PcMultiStep functions can be easily integrated where previously released functions may have been used</w:t>
+        <w:t xml:space="preserve"> In fact, these parameter lists are shared across all Pc calculation subfunctions (e.g., </w:t>
+      </w:r>
+      <w:proofErr w:type="spellStart"/>
+      <w:r>
+        <w:t>PcCircle.m</w:t>
+      </w:r>
+      <w:proofErr w:type="spellEnd"/>
+      <w:r>
+        <w:t xml:space="preserve">, Pc2D_Hall.m, etc.) so that the </w:t>
+      </w:r>
+      <w:proofErr w:type="spellStart"/>
+      <w:r>
+        <w:t>PcMultiStep</w:t>
+      </w:r>
+      <w:proofErr w:type="spellEnd"/>
+      <w:r>
+        <w:t xml:space="preserve"> functions can be easily integrated where previously released functions may have been used</w:t>
       </w:r>
       <w:r>
         <w:rPr>
@@ -2531,8 +2667,13 @@
         <w:lastRenderedPageBreak/>
         <w:t xml:space="preserve">As inputs, the </w:t>
       </w:r>
-      <w:r>
-        <w:t xml:space="preserve">PcMultiStep </w:t>
+      <w:proofErr w:type="spellStart"/>
+      <w:r>
+        <w:t>PcMultiStep</w:t>
+      </w:r>
+      <w:proofErr w:type="spellEnd"/>
+      <w:r>
+        <w:t xml:space="preserve"> </w:t>
       </w:r>
       <w:r>
         <w:t>function</w:t>
@@ -2585,9 +2726,11 @@
       <w:r>
         <w:t xml:space="preserve">: </w:t>
       </w:r>
+      <w:proofErr w:type="spellStart"/>
       <w:r>
         <w:t>PcMultiStep</w:t>
       </w:r>
+      <w:proofErr w:type="spellEnd"/>
       <w:r>
         <w:t xml:space="preserve"> </w:t>
       </w:r>
@@ -2966,8 +3109,13 @@
             <w:r>
               <w:t xml:space="preserve">A </w:t>
             </w:r>
-            <w:r>
-              <w:t xml:space="preserve">Matlab </w:t>
+            <w:proofErr w:type="spellStart"/>
+            <w:r>
+              <w:t>Matlab</w:t>
+            </w:r>
+            <w:proofErr w:type="spellEnd"/>
+            <w:r>
+              <w:t xml:space="preserve"> </w:t>
             </w:r>
             <w:r>
               <w:t xml:space="preserve">structure </w:t>
@@ -3007,9 +3155,11 @@
       <w:r>
         <w:t xml:space="preserve">The </w:t>
       </w:r>
+      <w:proofErr w:type="spellStart"/>
       <w:r>
         <w:t>PcMultiStep</w:t>
       </w:r>
+      <w:proofErr w:type="spellEnd"/>
       <w:r>
         <w:t xml:space="preserve"> </w:t>
       </w:r>
@@ -3067,9 +3217,11 @@
         </w:rPr>
         <w:t xml:space="preserve">: </w:t>
       </w:r>
+      <w:proofErr w:type="spellStart"/>
       <w:r>
         <w:t>PcMultiStep</w:t>
       </w:r>
+      <w:proofErr w:type="spellEnd"/>
       <w:r>
         <w:t xml:space="preserve"> </w:t>
       </w:r>
@@ -3174,8 +3326,13 @@
             <w:r>
               <w:t xml:space="preserve">the </w:t>
             </w:r>
-            <w:r>
-              <w:t>PcMultiStep method</w:t>
+            <w:proofErr w:type="spellStart"/>
+            <w:r>
+              <w:t>PcMultiStep</w:t>
+            </w:r>
+            <w:proofErr w:type="spellEnd"/>
+            <w:r>
+              <w:t xml:space="preserve"> method</w:t>
             </w:r>
             <w:r>
               <w:t xml:space="preserve"> </w:t>
@@ -3221,17 +3378,38 @@
               <w:spacing w:before="0" w:after="0"/>
             </w:pPr>
             <w:r>
-              <w:t>A Matlab structure holding a large number of auxiliary output variables. See the header</w:t>
+              <w:t xml:space="preserve">A </w:t>
+            </w:r>
+            <w:proofErr w:type="spellStart"/>
+            <w:r>
+              <w:t>Matlab</w:t>
+            </w:r>
+            <w:proofErr w:type="spellEnd"/>
+            <w:r>
+              <w:t xml:space="preserve"> structure holding </w:t>
+            </w:r>
+            <w:proofErr w:type="gramStart"/>
+            <w:r>
+              <w:t>a large number of</w:t>
+            </w:r>
+            <w:proofErr w:type="gramEnd"/>
+            <w:r>
+              <w:t xml:space="preserve"> auxiliary output variables. See the header</w:t>
             </w:r>
             <w:r>
               <w:t>s</w:t>
             </w:r>
             <w:r>
-              <w:t xml:space="preserve"> of the Pc</w:t>
+              <w:t xml:space="preserve"> of the </w:t>
+            </w:r>
+            <w:proofErr w:type="spellStart"/>
+            <w:r>
+              <w:t>Pc</w:t>
             </w:r>
             <w:r>
               <w:t>MultiStep</w:t>
             </w:r>
+            <w:proofErr w:type="spellEnd"/>
             <w:r>
               <w:t xml:space="preserve"> function</w:t>
             </w:r>
@@ -3250,8 +3428,13 @@
         <w:pStyle w:val="Heading3"/>
       </w:pPr>
       <w:bookmarkStart w:id="20" w:name="_Toc208937293"/>
-      <w:r>
-        <w:t>PcMultiStep Test Cases</w:t>
+      <w:proofErr w:type="spellStart"/>
+      <w:r>
+        <w:t>PcMultiStep</w:t>
+      </w:r>
+      <w:proofErr w:type="spellEnd"/>
+      <w:r>
+        <w:t xml:space="preserve"> Test Cases</w:t>
       </w:r>
       <w:bookmarkEnd w:id="20"/>
     </w:p>
@@ -3271,8 +3454,13 @@
       <w:r>
         <w:t xml:space="preserve"> are contained within the </w:t>
       </w:r>
-      <w:r>
-        <w:t xml:space="preserve">PcTestCaseCDMs directory of the SDK. This directory contains a set of 53 actual CARA conjunctions that have </w:t>
+      <w:proofErr w:type="spellStart"/>
+      <w:r>
+        <w:t>PcTestCaseCDMs</w:t>
+      </w:r>
+      <w:proofErr w:type="spellEnd"/>
+      <w:r>
+        <w:t xml:space="preserve"> directory of the SDK. This directory contains a set of 53 actual CARA conjunctions that have </w:t>
       </w:r>
       <w:r>
         <w:lastRenderedPageBreak/>
@@ -3300,8 +3488,21 @@
         <w:t>SDK</w:t>
       </w:r>
       <w:r>
-        <w:t>/DataFiles/PcTestCaseCDMs</w:t>
-      </w:r>
+        <w:t>/</w:t>
+      </w:r>
+      <w:proofErr w:type="spellStart"/>
+      <w:r>
+        <w:t>DataFiles</w:t>
+      </w:r>
+      <w:proofErr w:type="spellEnd"/>
+      <w:r>
+        <w:t>/</w:t>
+      </w:r>
+      <w:proofErr w:type="spellStart"/>
+      <w:r>
+        <w:t>PcTestCaseCDMs</w:t>
+      </w:r>
+      <w:proofErr w:type="spellEnd"/>
     </w:p>
     <w:p>
       <w:pPr>
@@ -3311,10 +3512,23 @@
         <w:t xml:space="preserve">The spreadsheet named “CARA_PcMethod_Test_Conjunctions.xlsx” </w:t>
       </w:r>
       <w:r>
-        <w:t xml:space="preserve">contains a listing of each test case, a description of the expected PcMultiStep results (in the “Comment” column), metadata about the objects involved, and various quantities calculated by CARA using the official software baseline. A “README.md” document (in Markdown format) details the nuances of comparing test outputs across </w:t>
-      </w:r>
-      <w:r>
-        <w:t xml:space="preserve">Matlab versions and hardware architectures. </w:t>
+        <w:t xml:space="preserve">contains a listing of each test case, a description of the expected </w:t>
+      </w:r>
+      <w:proofErr w:type="spellStart"/>
+      <w:r>
+        <w:t>PcMultiStep</w:t>
+      </w:r>
+      <w:proofErr w:type="spellEnd"/>
+      <w:r>
+        <w:t xml:space="preserve"> results (in the “Comment” column), metadata about the objects involved, and various quantities calculated by CARA using the official software baseline. A “README.md” document (in Markdown format) details the nuances of comparing test outputs across </w:t>
+      </w:r>
+      <w:proofErr w:type="spellStart"/>
+      <w:r>
+        <w:t>Matlab</w:t>
+      </w:r>
+      <w:proofErr w:type="spellEnd"/>
+      <w:r>
+        <w:t xml:space="preserve"> versions and hardware architectures. </w:t>
       </w:r>
       <w:r>
         <w:t xml:space="preserve">A detailed read of the README is suggested before running the comparisons on </w:t>
@@ -3331,7 +3545,23 @@
         <w:pStyle w:val="BodyText"/>
       </w:pPr>
       <w:r>
-        <w:t>The function “ComparePcMultiStep_to_CARAValues.m” provides a means of running every CDM provided within the directory, and comparing the local outputs against CARA computed values.</w:t>
+        <w:t>The function “</w:t>
+      </w:r>
+      <w:proofErr w:type="spellStart"/>
+      <w:r>
+        <w:t>ComparePcMultiStep_to_CARAValues.m</w:t>
+      </w:r>
+      <w:proofErr w:type="spellEnd"/>
+      <w:r>
+        <w:t xml:space="preserve">” provides a means of running every CDM provided within the </w:t>
+      </w:r>
+      <w:proofErr w:type="gramStart"/>
+      <w:r>
+        <w:t>directory, and</w:t>
+      </w:r>
+      <w:proofErr w:type="gramEnd"/>
+      <w:r>
+        <w:t xml:space="preserve"> comparing the local outputs against CARA computed values.</w:t>
       </w:r>
     </w:p>
     <w:p>
@@ -3339,7 +3569,15 @@
         <w:pStyle w:val="BodyText"/>
       </w:pPr>
       <w:r>
-        <w:t>The inputs to ComparePcMultiStep_to_CARAValues.m are:</w:t>
+        <w:t xml:space="preserve">The inputs to </w:t>
+      </w:r>
+      <w:proofErr w:type="spellStart"/>
+      <w:r>
+        <w:t>ComparePcMultiStep_to_CARAValues.m</w:t>
+      </w:r>
+      <w:proofErr w:type="spellEnd"/>
+      <w:r>
+        <w:t xml:space="preserve"> are:</w:t>
       </w:r>
     </w:p>
     <w:p>
@@ -3383,9 +3621,11 @@
       <w:r>
         <w:t xml:space="preserve">: </w:t>
       </w:r>
+      <w:proofErr w:type="spellStart"/>
       <w:r>
         <w:t>ComparePcMultiStep_to_CARAValues</w:t>
       </w:r>
+      <w:proofErr w:type="spellEnd"/>
       <w:r>
         <w:t xml:space="preserve"> </w:t>
       </w:r>
@@ -3470,9 +3710,11 @@
               <w:pStyle w:val="BodyText"/>
               <w:spacing w:before="0" w:after="0"/>
             </w:pPr>
+            <w:proofErr w:type="spellStart"/>
             <w:r>
               <w:t>PcMethod</w:t>
             </w:r>
+            <w:proofErr w:type="spellEnd"/>
           </w:p>
         </w:tc>
         <w:tc>
@@ -3485,7 +3727,55 @@
               <w:spacing w:before="0" w:after="0"/>
             </w:pPr>
             <w:r>
-              <w:t>(Optional) The PcMultiStep method to compare, valid values are: ‘Pc2D’, ‘Nc2D’, ‘Nc3D’, or ‘SDMCPc’.</w:t>
+              <w:t xml:space="preserve">(Optional) The </w:t>
+            </w:r>
+            <w:proofErr w:type="spellStart"/>
+            <w:r>
+              <w:t>PcMultiStep</w:t>
+            </w:r>
+            <w:proofErr w:type="spellEnd"/>
+            <w:r>
+              <w:t xml:space="preserve"> method to </w:t>
+            </w:r>
+            <w:proofErr w:type="gramStart"/>
+            <w:r>
+              <w:t>compare,</w:t>
+            </w:r>
+            <w:proofErr w:type="gramEnd"/>
+            <w:r>
+              <w:t xml:space="preserve"> valid values </w:t>
+            </w:r>
+            <w:proofErr w:type="gramStart"/>
+            <w:r>
+              <w:t>are: ‘</w:t>
+            </w:r>
+            <w:proofErr w:type="gramEnd"/>
+            <w:r>
+              <w:t>Pc2D</w:t>
+            </w:r>
+            <w:proofErr w:type="gramStart"/>
+            <w:r>
+              <w:t>’, ‘</w:t>
+            </w:r>
+            <w:proofErr w:type="gramEnd"/>
+            <w:r>
+              <w:t>Nc2D</w:t>
+            </w:r>
+            <w:proofErr w:type="gramStart"/>
+            <w:r>
+              <w:t>’, ‘</w:t>
+            </w:r>
+            <w:proofErr w:type="gramEnd"/>
+            <w:r>
+              <w:t>Nc3D’, or ‘</w:t>
+            </w:r>
+            <w:proofErr w:type="spellStart"/>
+            <w:r>
+              <w:t>SDMCPc</w:t>
+            </w:r>
+            <w:proofErr w:type="spellEnd"/>
+            <w:r>
+              <w:t>’.</w:t>
             </w:r>
           </w:p>
           <w:p>
@@ -3513,9 +3803,11 @@
               <w:pStyle w:val="BodyText"/>
               <w:spacing w:before="0" w:after="0"/>
             </w:pPr>
+            <w:proofErr w:type="spellStart"/>
             <w:r>
               <w:t>highAccuracySDMC</w:t>
             </w:r>
+            <w:proofErr w:type="spellEnd"/>
           </w:p>
         </w:tc>
         <w:tc>
@@ -3528,7 +3820,39 @@
               <w:spacing w:before="0" w:after="0"/>
             </w:pPr>
             <w:r>
-              <w:t>(Optional) If the PcMethod is ‘SDMCPc’ and this value is set to true, then the SDMC method will be run in a high-accuracy mode that is designed to exactly replicate CARA SDMC Pc values. If the PcMethod is not ‘SDMCPc’, then this option has no effect.</w:t>
+              <w:t xml:space="preserve">(Optional) If the </w:t>
+            </w:r>
+            <w:proofErr w:type="spellStart"/>
+            <w:r>
+              <w:t>PcMethod</w:t>
+            </w:r>
+            <w:proofErr w:type="spellEnd"/>
+            <w:r>
+              <w:t xml:space="preserve"> is ‘</w:t>
+            </w:r>
+            <w:proofErr w:type="spellStart"/>
+            <w:r>
+              <w:t>SDMCPc</w:t>
+            </w:r>
+            <w:proofErr w:type="spellEnd"/>
+            <w:r>
+              <w:t xml:space="preserve">’ and this value is set to true, then the SDMC method will be run in a high-accuracy mode that is designed to exactly replicate CARA SDMC Pc values. If the </w:t>
+            </w:r>
+            <w:proofErr w:type="spellStart"/>
+            <w:r>
+              <w:t>PcMethod</w:t>
+            </w:r>
+            <w:proofErr w:type="spellEnd"/>
+            <w:r>
+              <w:t xml:space="preserve"> is not ‘</w:t>
+            </w:r>
+            <w:proofErr w:type="spellStart"/>
+            <w:r>
+              <w:t>SDMCPc</w:t>
+            </w:r>
+            <w:proofErr w:type="spellEnd"/>
+            <w:r>
+              <w:t>’, then this option has no effect.</w:t>
             </w:r>
           </w:p>
           <w:p>
@@ -3565,9 +3889,11 @@
               <w:pStyle w:val="BodyText"/>
               <w:spacing w:before="0" w:after="0"/>
             </w:pPr>
+            <w:proofErr w:type="spellStart"/>
             <w:r>
               <w:t>numToRun</w:t>
             </w:r>
+            <w:proofErr w:type="spellEnd"/>
           </w:p>
         </w:tc>
         <w:tc>
@@ -3580,10 +3906,50 @@
               <w:spacing w:before="0" w:after="0"/>
             </w:pPr>
             <w:r>
-              <w:t xml:space="preserve">(Optional) If the PcMethod is ‘SDMCPc’ this value will specify the number of test cases to run. This will save some time if a user only wants to run a subset of conjunctions to make sure SDMC is running correctly without </w:t>
-            </w:r>
-            <w:r>
-              <w:t>going through the whole set. When empty, all conjunctions will be run. If the PcMethod is not ‘SDMCPc’, then this option has no effect.</w:t>
+              <w:t xml:space="preserve">(Optional) If the </w:t>
+            </w:r>
+            <w:proofErr w:type="spellStart"/>
+            <w:r>
+              <w:t>PcMethod</w:t>
+            </w:r>
+            <w:proofErr w:type="spellEnd"/>
+            <w:r>
+              <w:t xml:space="preserve"> is ‘</w:t>
+            </w:r>
+            <w:proofErr w:type="spellStart"/>
+            <w:r>
+              <w:t>SDMCPc</w:t>
+            </w:r>
+            <w:proofErr w:type="spellEnd"/>
+            <w:r>
+              <w:t xml:space="preserve">’ this value will specify the number of test cases to run. This will save some time if a user only wants to run a subset of conjunctions to make sure SDMC is running correctly without </w:t>
+            </w:r>
+            <w:r>
+              <w:t xml:space="preserve">going through the whole set. When </w:t>
+            </w:r>
+            <w:proofErr w:type="gramStart"/>
+            <w:r>
+              <w:t>empty</w:t>
+            </w:r>
+            <w:proofErr w:type="gramEnd"/>
+            <w:r>
+              <w:t xml:space="preserve">, all conjunctions will be run. If the </w:t>
+            </w:r>
+            <w:proofErr w:type="spellStart"/>
+            <w:r>
+              <w:t>PcMethod</w:t>
+            </w:r>
+            <w:proofErr w:type="spellEnd"/>
+            <w:r>
+              <w:t xml:space="preserve"> is not ‘</w:t>
+            </w:r>
+            <w:proofErr w:type="spellStart"/>
+            <w:r>
+              <w:t>SDMCPc</w:t>
+            </w:r>
+            <w:proofErr w:type="spellEnd"/>
+            <w:r>
+              <w:t>’, then this option has no effect.</w:t>
             </w:r>
           </w:p>
           <w:p>
@@ -3611,7 +3977,15 @@
       </w:pPr>
       <w:r>
         <w:lastRenderedPageBreak/>
-        <w:t>The ComparePcMultiStep_to_CARAValues function outputs the following:</w:t>
+        <w:t xml:space="preserve">The </w:t>
+      </w:r>
+      <w:proofErr w:type="spellStart"/>
+      <w:r>
+        <w:t>ComparePcMultiStep_to_CARAValues</w:t>
+      </w:r>
+      <w:proofErr w:type="spellEnd"/>
+      <w:r>
+        <w:t xml:space="preserve"> function outputs the following:</w:t>
       </w:r>
     </w:p>
     <w:p>
@@ -3658,9 +4032,11 @@
         </w:rPr>
         <w:t xml:space="preserve">: </w:t>
       </w:r>
+      <w:proofErr w:type="spellStart"/>
       <w:r>
         <w:t>ComparePcMultiStep_to_CARAValues</w:t>
       </w:r>
+      <w:proofErr w:type="spellEnd"/>
       <w:r>
         <w:t xml:space="preserve"> </w:t>
       </w:r>
@@ -3745,9 +4121,11 @@
               <w:pStyle w:val="BodyText"/>
               <w:spacing w:before="0" w:after="0"/>
             </w:pPr>
+            <w:proofErr w:type="spellStart"/>
             <w:r>
               <w:t>compareData</w:t>
             </w:r>
+            <w:proofErr w:type="spellEnd"/>
           </w:p>
         </w:tc>
         <w:tc>
@@ -3760,7 +4138,15 @@
               <w:spacing w:before="0" w:after="0"/>
             </w:pPr>
             <w:r>
-              <w:t>A table containing comparison information for each CDM analyzed. See the function description for more information on the comparison outputs supplied, especially for SDMC. If the function is called without this variable, then a text output of the comparison is printed to the Matlab console window.</w:t>
+              <w:t xml:space="preserve">A table containing comparison information for each CDM analyzed. See the function description for more information on the comparison outputs supplied, especially for SDMC. If the function is called without this variable, then a text output of the comparison is printed to the </w:t>
+            </w:r>
+            <w:proofErr w:type="spellStart"/>
+            <w:r>
+              <w:t>Matlab</w:t>
+            </w:r>
+            <w:proofErr w:type="spellEnd"/>
+            <w:r>
+              <w:t xml:space="preserve"> console window.</w:t>
             </w:r>
           </w:p>
         </w:tc>
@@ -3772,8 +4158,13 @@
       </w:pPr>
       <w:bookmarkStart w:id="23" w:name="_Ref208936996"/>
       <w:bookmarkStart w:id="24" w:name="_Toc208937294"/>
-      <w:r>
-        <w:t>PcMultiStep Plots</w:t>
+      <w:proofErr w:type="spellStart"/>
+      <w:r>
+        <w:t>PcMultiStep</w:t>
+      </w:r>
+      <w:proofErr w:type="spellEnd"/>
+      <w:r>
+        <w:t xml:space="preserve"> Plots</w:t>
       </w:r>
       <w:bookmarkEnd w:id="23"/>
       <w:bookmarkEnd w:id="24"/>
@@ -3783,7 +4174,15 @@
         <w:pStyle w:val="BodyText"/>
       </w:pPr>
       <w:r>
-        <w:t>The PcMultiStepWithPlots.m function will generate two types of plots.</w:t>
+        <w:t xml:space="preserve">The </w:t>
+      </w:r>
+      <w:proofErr w:type="spellStart"/>
+      <w:r>
+        <w:t>PcMultiStepWithPlots.m</w:t>
+      </w:r>
+      <w:proofErr w:type="spellEnd"/>
+      <w:r>
+        <w:t xml:space="preserve"> function will generate two types of plots.</w:t>
       </w:r>
       <w:r>
         <w:t xml:space="preserve"> The following sections </w:t>
@@ -3860,7 +4259,15 @@
         <w:pStyle w:val="BodyText"/>
       </w:pPr>
       <w:r>
-        <w:t>In this case, the bottom panel shows that the distribution of MC points does not align well with the 2D-Pc method covariance ellipse. This misalignment graphically illustrates that the 2D-Pc method has at least one usage violation, and therefore may not provide an accurate probability estimate for this conjunction. T</w:t>
+        <w:t xml:space="preserve">In this case, the bottom panel shows that the distribution of MC points does not align well with the 2D-Pc method covariance ellipse. This misalignment graphically illustrates that the 2D-Pc method has at least one usage </w:t>
+      </w:r>
+      <w:proofErr w:type="gramStart"/>
+      <w:r>
+        <w:t>violation, and</w:t>
+      </w:r>
+      <w:proofErr w:type="gramEnd"/>
+      <w:r>
+        <w:t xml:space="preserve"> therefore may not provide an accurate probability estimate for this conjunction. T</w:t>
       </w:r>
       <w:r>
         <w:t xml:space="preserve">he 2D-Pc method </w:t>
@@ -3885,10 +4292,10 @@
         </w:rPr>
         <w:lastRenderedPageBreak/>
         <w:drawing>
-          <wp:inline distT="0" distB="0" distL="0" distR="0" wp14:anchorId="0FA25F3E" wp14:editId="14ABA13B">
-            <wp:extent cx="5943600" cy="3963035"/>
-            <wp:effectExtent l="0" t="0" r="0" b="0"/>
-            <wp:docPr id="753445568" name="Picture 1" descr="Chart&#10;&#10;AI-generated content may be incorrect."/>
+          <wp:inline distT="0" distB="0" distL="0" distR="0" wp14:anchorId="0FA25F3E" wp14:editId="117B6994">
+            <wp:extent cx="5943600" cy="3960558"/>
+            <wp:effectExtent l="0" t="0" r="0" b="1905"/>
+            <wp:docPr id="753445568" name="Picture 1"/>
             <wp:cNvGraphicFramePr>
               <a:graphicFrameLocks xmlns:a="http://schemas.openxmlformats.org/drawingml/2006/main" noChangeAspect="1"/>
             </wp:cNvGraphicFramePr>
@@ -3896,7 +4303,7 @@
               <a:graphicData uri="http://schemas.openxmlformats.org/drawingml/2006/picture">
                 <pic:pic xmlns:pic="http://schemas.openxmlformats.org/drawingml/2006/picture">
                   <pic:nvPicPr>
-                    <pic:cNvPr id="753445568" name="Picture 1" descr="Chart&#10;&#10;AI-generated content may be incorrect."/>
+                    <pic:cNvPr id="753445568" name="Picture 1"/>
                     <pic:cNvPicPr/>
                   </pic:nvPicPr>
                   <pic:blipFill>
@@ -3914,7 +4321,7 @@
                   <pic:spPr>
                     <a:xfrm>
                       <a:off x="0" y="0"/>
-                      <a:ext cx="5943600" cy="3963035"/>
+                      <a:ext cx="5943600" cy="3960558"/>
                     </a:xfrm>
                     <a:prstGeom prst="rect">
                       <a:avLst/>
@@ -3961,7 +4368,15 @@
         <w:pStyle w:val="BodyText"/>
       </w:pPr>
       <w:r>
-        <w:t>Hall et. al. (2018)</w:t>
+        <w:t xml:space="preserve">Hall et. </w:t>
+      </w:r>
+      <w:proofErr w:type="gramStart"/>
+      <w:r>
+        <w:t>al</w:t>
+      </w:r>
+      <w:proofErr w:type="gramEnd"/>
+      <w:r>
+        <w:t>. (2018)</w:t>
       </w:r>
       <w:r>
         <w:rPr>
@@ -4919,7 +5334,15 @@
         <w:t xml:space="preserve"> While the basic inputs and outputs remain the same, additional input and output parameters (“params” and “out” structures, respectively)</w:t>
       </w:r>
       <w:r>
-        <w:t xml:space="preserve"> are different. Integration of PcMultiStep functions will likely require some work to resolve differences within these structures.</w:t>
+        <w:t xml:space="preserve"> are different. Integration of </w:t>
+      </w:r>
+      <w:proofErr w:type="spellStart"/>
+      <w:r>
+        <w:t>PcMultiStep</w:t>
+      </w:r>
+      <w:proofErr w:type="spellEnd"/>
+      <w:r>
+        <w:t xml:space="preserve"> functions will likely require some work to resolve differences within these structures.</w:t>
       </w:r>
     </w:p>
   </w:footnote>

</xml_diff>